<commit_message>
add beta/investor DB logging, prep prod config
</commit_message>
<xml_diff>
--- a/Omnis/Omnis new/Omnis_DPIA_and_GDPR_Governance_Document.docx
+++ b/Omnis/Omnis new/Omnis_DPIA_and_GDPR_Governance_Document.docx
@@ -415,6 +415,290 @@
         <w:t>Each school acts as Data Controller. Omnis operates as Data Processor. A Data Processing Agreement (DPA) is required. Schools may opt out of anonymised contribution to global improvement insights.</w:t>
       </w:r>
     </w:p>
+    <w:p>
+      <w:pPr>
+        <w:pStyle w:val="Heading1"/>
+      </w:pPr>
+      <w:r>
+        <w:t>13. ICO Children’s Code (Age Appropriate Design Code) Assessment</w:t>
+      </w:r>
+    </w:p>
+    <w:p>
+      <w:r>
+        <w:t>Omnis processes the personal data of children (Year 7–13, i.e. under 18) and is therefore assessed against the ICO’s Age Appropriate Design Code (the “Children’s Code”). For the core educational functions listed in Section 2, Omnis acts as a digital extension of each school’s offline activities, processing solely on the school’s instruction as Data Processor (Section 12). This assessment is nonetheless applied as best practice across the whole platform, because one processing activity — the cross-school insight pipeline described under Standard 9 below — involves Omnis determining its own processing purpose, which is the point at which the code is most likely to apply directly rather than by extension.</w:t>
+      </w:r>
+    </w:p>
+    <w:p>
+      <w:r>
+        <w:rPr>
+          <w:b/>
+        </w:rPr>
+        <w:t>13.1 Assessment Against the 15 Standards</w:t>
+      </w:r>
+    </w:p>
+    <w:p>
+      <w:pPr>
+        <w:pStyle w:val="ListBullet"/>
+      </w:pPr>
+      <w:r>
+        <w:rPr>
+          <w:b/>
+        </w:rPr>
+        <w:t xml:space="preserve">Standard 1 – Best interests of the child: </w:t>
+      </w:r>
+      <w:r>
+        <w:t>Met. AI-assisted outputs (homework generation, SEND adaptation, ILP drafts) never take effect without a named member of staff’s review — SENCo activation for SEND plans, teacher confirmation for integrity flags before grade release (Section 9). Safeguarding, behaviour, detention and exclusion records route to named staff, not automated action.</w:t>
+      </w:r>
+    </w:p>
+    <w:p>
+      <w:pPr>
+        <w:pStyle w:val="ListBullet"/>
+      </w:pPr>
+      <w:r>
+        <w:rPr>
+          <w:b/>
+        </w:rPr>
+        <w:t xml:space="preserve">Standard 2 – Data protection impact assessments: </w:t>
+      </w:r>
+      <w:r>
+        <w:t>Met by this document. This DPIA now builds in Children’s Code compliance directly, and the risk register in Section 10 is read as extending to the child-specific risks identified in 13.2 below.</w:t>
+      </w:r>
+    </w:p>
+    <w:p>
+      <w:pPr>
+        <w:pStyle w:val="ListBullet"/>
+      </w:pPr>
+      <w:r>
+        <w:rPr>
+          <w:b/>
+        </w:rPr>
+        <w:t xml:space="preserve">Standard 3 – Age appropriate application: </w:t>
+      </w:r>
+      <w:r>
+        <w:t>Met. There is no public or self-service sign-up route for students — accounts are provisioned by the school and age is established with certainty via MIS-synchronised year-group data (Wonde sync), not self-declaration. This should be recorded as the formal age-assurance method.</w:t>
+      </w:r>
+    </w:p>
+    <w:p>
+      <w:pPr>
+        <w:pStyle w:val="ListBullet"/>
+      </w:pPr>
+      <w:r>
+        <w:rPr>
+          <w:b/>
+        </w:rPr>
+        <w:t xml:space="preserve">Standard 4 – Transparency: </w:t>
+      </w:r>
+      <w:r>
+        <w:t>Partial — outstanding action. Current privacy information (this DPIA, the DPA) is written for school/staff audiences. A concise, age-appropriate, “bite-sized” explanation is not yet surfaced to students at the point data is used (e.g. first login, first AI-generated homework). See 13.3.</w:t>
+      </w:r>
+    </w:p>
+    <w:p>
+      <w:pPr>
+        <w:pStyle w:val="ListBullet"/>
+      </w:pPr>
+      <w:r>
+        <w:rPr>
+          <w:b/>
+        </w:rPr>
+        <w:t xml:space="preserve">Standard 5 – Detrimental use of data: </w:t>
+      </w:r>
+      <w:r>
+        <w:t>Met. Integrity monitoring, behaviour records and early-warning flags trigger human review only, never automated sanctions; already covered by the misclassification mitigation in Section 10.</w:t>
+      </w:r>
+    </w:p>
+    <w:p>
+      <w:pPr>
+        <w:pStyle w:val="ListBullet"/>
+      </w:pPr>
+      <w:r>
+        <w:rPr>
+          <w:b/>
+        </w:rPr>
+        <w:t xml:space="preserve">Standard 6 – Policies and community standards: </w:t>
+      </w:r>
+      <w:r>
+        <w:t>Met by inheritance. Omnis does not author a separate child-facing community standard; it operates within each school’s own behaviour and safeguarding policy. This alignment should be stated explicitly in the DPA template.</w:t>
+      </w:r>
+    </w:p>
+    <w:p>
+      <w:pPr>
+        <w:pStyle w:val="ListBullet"/>
+      </w:pPr>
+      <w:r>
+        <w:rPr>
+          <w:b/>
+        </w:rPr>
+        <w:t xml:space="preserve">Standard 7 – Default settings: </w:t>
+      </w:r>
+      <w:r>
+        <w:t>Partial — outstanding action. Default configuration of messaging visibility, notification scope and accessibility settings has not yet been formally audited for “high privacy by default.” See 13.3.</w:t>
+      </w:r>
+    </w:p>
+    <w:p>
+      <w:pPr>
+        <w:pStyle w:val="ListBullet"/>
+      </w:pPr>
+      <w:r>
+        <w:rPr>
+          <w:b/>
+        </w:rPr>
+        <w:t xml:space="preserve">Standard 8 – Data minimisation: </w:t>
+      </w:r>
+      <w:r>
+        <w:t>Met — see Section 5. Only operationally required data is stored, no raw keystrokes are retained, and integrity monitoring stores aggregated signal metrics only.</w:t>
+      </w:r>
+    </w:p>
+    <w:p>
+      <w:pPr>
+        <w:pStyle w:val="ListBullet"/>
+      </w:pPr>
+      <w:r>
+        <w:rPr>
+          <w:b/>
+        </w:rPr>
+        <w:t xml:space="preserve">Standard 9 – Data sharing: </w:t>
+      </w:r>
+      <w:r>
+        <w:t>Met, with the compelling-reason justification now made explicit. Sharing occurs in three contexts: inbound MIS sync (Wonde), structured parent communication within the same family unit, and the cross-school SchoolCohortAggregate / PlatformInsight pipeline. The last is protected by a k-anonymity threshold (no insight is written unless at least 3 schools contribute), meaning no individual child’s data is disclosed or re-identifiable across schools.</w:t>
+      </w:r>
+    </w:p>
+    <w:p>
+      <w:pPr>
+        <w:pStyle w:val="ListBullet"/>
+      </w:pPr>
+      <w:r>
+        <w:rPr>
+          <w:b/>
+        </w:rPr>
+        <w:t xml:space="preserve">Standard 10 – Geolocation: </w:t>
+      </w:r>
+      <w:r>
+        <w:t>Not applicable. Omnis does not collect or use device geolocation data.</w:t>
+      </w:r>
+    </w:p>
+    <w:p>
+      <w:pPr>
+        <w:pStyle w:val="ListBullet"/>
+      </w:pPr>
+      <w:r>
+        <w:rPr>
+          <w:b/>
+        </w:rPr>
+        <w:t xml:space="preserve">Standard 11 – Parental controls: </w:t>
+      </w:r>
+      <w:r>
+        <w:t>Partial — outstanding action. The parent portal (grades, messages, progress) is a designed feature within structured time windows, not covert monitoring, but the student-facing UI does not yet carry an obvious sign of what a parent/carer can see. See 13.3.</w:t>
+      </w:r>
+    </w:p>
+    <w:p>
+      <w:pPr>
+        <w:pStyle w:val="ListBullet"/>
+      </w:pPr>
+      <w:r>
+        <w:rPr>
+          <w:b/>
+        </w:rPr>
+        <w:t xml:space="preserve">Standard 12 – Profiling: </w:t>
+      </w:r>
+      <w:r>
+        <w:t>Met. Predicted-grade, RAG status and adaptive-learning outputs constitute profiling, retained for the legitimate educational purpose under Article 6(1)(e) and already protected by the human-review requirement in Section 9 and SENCo/teacher sign-off on SEND-related outputs. No automated decision with legal or significant effect is made without review.</w:t>
+      </w:r>
+    </w:p>
+    <w:p>
+      <w:pPr>
+        <w:pStyle w:val="ListBullet"/>
+      </w:pPr>
+      <w:r>
+        <w:rPr>
+          <w:b/>
+        </w:rPr>
+        <w:t xml:space="preserve">Standard 13 – Nudge techniques: </w:t>
+      </w:r>
+      <w:r>
+        <w:t>Met. No streaks, rewards or engagement-maximising nudges are used to extract additional data or weaken privacy settings; homework and revision reminders are informational only. Re-confirm if gamification features are added on the roadmap.</w:t>
+      </w:r>
+    </w:p>
+    <w:p>
+      <w:pPr>
+        <w:pStyle w:val="ListBullet"/>
+      </w:pPr>
+      <w:r>
+        <w:rPr>
+          <w:b/>
+        </w:rPr>
+        <w:t xml:space="preserve">Standard 14 – Connected toys and devices: </w:t>
+      </w:r>
+      <w:r>
+        <w:t>Not applicable. Omnis has no connected hardware.</w:t>
+      </w:r>
+    </w:p>
+    <w:p>
+      <w:pPr>
+        <w:pStyle w:val="ListBullet"/>
+      </w:pPr>
+      <w:r>
+        <w:rPr>
+          <w:b/>
+        </w:rPr>
+        <w:t xml:space="preserve">Standard 15 – Online tools: </w:t>
+      </w:r>
+      <w:r>
+        <w:t>Partial — outstanding action. Data subject rights (Section 8) are currently exercised via the school as Data Controller, which is appropriate for a processor, but there is no direct-to-student mechanism inside the product to ask a question or flag a concern about their data. See 13.3.</w:t>
+      </w:r>
+    </w:p>
+    <w:p>
+      <w:r>
+        <w:rPr>
+          <w:b/>
+        </w:rPr>
+        <w:t>13.2 Outstanding Actions</w:t>
+      </w:r>
+    </w:p>
+    <w:p>
+      <w:pPr>
+        <w:pStyle w:val="ListBullet"/>
+      </w:pPr>
+      <w:r>
+        <w:t>Produce a concise, age-appropriate transparency notice surfaced at point of use (first login; first AI-generated homework/feedback) — Standard 4.</w:t>
+      </w:r>
+    </w:p>
+    <w:p>
+      <w:pPr>
+        <w:pStyle w:val="ListBullet"/>
+      </w:pPr>
+      <w:r>
+        <w:t>Audit default settings in UserSettings, UserAccessibilitySettings and messaging for “high privacy by default” — Standard 7.</w:t>
+      </w:r>
+    </w:p>
+    <w:p>
+      <w:pPr>
+        <w:pStyle w:val="ListBullet"/>
+      </w:pPr>
+      <w:r>
+        <w:t>Add a visible “shared with your parent/carer” indicator in the student-facing UI wherever parent-linked data sharing applies — Standard 11.</w:t>
+      </w:r>
+    </w:p>
+    <w:p>
+      <w:pPr>
+        <w:pStyle w:val="ListBullet"/>
+      </w:pPr>
+      <w:r>
+        <w:t>Add a simple, age-appropriate “how your data is used / who to ask” link for students, routed to the school’s DPO — Standard 15.</w:t>
+      </w:r>
+    </w:p>
+    <w:p>
+      <w:pPr>
+        <w:pStyle w:val="ListBullet"/>
+      </w:pPr>
+      <w:r>
+        <w:t>Formally record the age-assurance methodology (school-provisioned accounts plus MIS year-group data) as a standing governance record — Standard 3.</w:t>
+      </w:r>
+    </w:p>
+    <w:p>
+      <w:r>
+        <w:t>These actions are tracked in OMNIS_GO_LIVE_TESTING_AND_ACCREDITATION_CHECKLIST.md, Phase 8.1, and should be closed out before Omnis is treated as fully Children’s Code compliant.</w:t>
+      </w:r>
+    </w:p>
     <w:sectPr>
       <w:pgSz w:w="12240" w:h="15840"/>
       <w:pgMar w:top="1440" w:right="1800" w:bottom="1440" w:left="1800" w:header="720" w:footer="720" w:gutter="0"/>

</xml_diff>